<commit_message>
feat: Menambahkan deployment FastAPI, UI Streamlit, dan file monitoring
</commit_message>
<xml_diff>
--- a/LAPORAN PRAKTIKUM MACHINE LEARNING.docx
+++ b/LAPORAN PRAKTIKUM MACHINE LEARNING.docx
@@ -10143,6 +10143,7 @@
           <w:ilvl w:val="0"/>
           <w:numId w:val="6"/>
         </w:numPr>
+        <w:spacing w:after="0"/>
         <w:ind w:left="709"/>
         <w:rPr>
           <w:rFonts w:ascii="Times New Roman" w:eastAsia="Times New Roman" w:hAnsi="Times New Roman" w:cs="Times New Roman"/>
@@ -10326,8 +10327,8 @@
           <w:noProof/>
         </w:rPr>
         <w:drawing>
-          <wp:inline distT="0" distB="0" distL="0" distR="0" wp14:anchorId="3E19F1FF" wp14:editId="3AAF2E61">
-            <wp:extent cx="5579745" cy="4114800"/>
+          <wp:inline distT="0" distB="0" distL="0" distR="0" wp14:anchorId="3E19F1FF" wp14:editId="4A217D18">
+            <wp:extent cx="5579745" cy="4709160"/>
             <wp:effectExtent l="0" t="0" r="1905" b="0"/>
             <wp:docPr id="913910981" name="Picture 1"/>
             <wp:cNvGraphicFramePr>
@@ -10349,7 +10350,7 @@
                   <pic:spPr>
                     <a:xfrm>
                       <a:off x="0" y="0"/>
-                      <a:ext cx="5579745" cy="4114800"/>
+                      <a:ext cx="5579745" cy="4709160"/>
                     </a:xfrm>
                     <a:prstGeom prst="rect">
                       <a:avLst/>

</xml_diff>